<commit_message>
Update - Concept Files
</commit_message>
<xml_diff>
--- a/ideas_ressources_files/game_design_document.docx
+++ b/ideas_ressources_files/game_design_document.docx
@@ -396,12 +396,16 @@
       <w:r>
         <w:t xml:space="preserve"> can be used to remove the plant.</w:t>
       </w:r>
+      <w:r>
+        <w:br w:type="page"/>
+      </w:r>
     </w:p>
     <w:p>
       <w:pPr>
         <w:pStyle w:val="Titre2"/>
       </w:pPr>
       <w:r>
+        <w:lastRenderedPageBreak/>
         <w:t>4 – Player Character</w:t>
       </w:r>
     </w:p>
@@ -412,8 +416,128 @@
     </w:p>
     <w:p>
       <w:r>
+        <w:t xml:space="preserve">There are currently three player characters planned for the game: Crazy Dave, as well as Nate Timely and Patrice Blazing from the </w:t>
+      </w:r>
+      <w:proofErr w:type="spellStart"/>
+      <w:r>
+        <w:t>PvZ</w:t>
+      </w:r>
+      <w:proofErr w:type="spellEnd"/>
+      <w:r>
+        <w:t xml:space="preserve"> comics. The latter two are not available by default, instead unlocked by playing the campaign mode explain in the following chapter.</w:t>
+      </w:r>
+    </w:p>
+    <w:p>
+      <w:pPr>
+        <w:pStyle w:val="Titre3"/>
+      </w:pPr>
+      <w:r>
+        <w:t>Crazy Dave</w:t>
+      </w:r>
+    </w:p>
+    <w:p>
+      <w:r>
+        <w:t xml:space="preserve">Crazy Dave’s power reflects his caretaker personality, as the creator and keeper of the plants. In the comics especially, Crazy Dave shows he cares a lot for the plants. This is also seen in the </w:t>
+      </w:r>
+      <w:proofErr w:type="spellStart"/>
+      <w:r>
+        <w:t>PvZ</w:t>
+      </w:r>
+      <w:proofErr w:type="spellEnd"/>
+      <w:r>
+        <w:t xml:space="preserve"> games, with the various entries of the Zen Garden and plant buffs.</w:t>
+      </w:r>
+    </w:p>
+    <w:p>
+      <w:r>
+        <w:t xml:space="preserve">As such, Crazy Dave’s power will make him occasionally buff a plant. At the start, this can be a simple temporary attack speed buff by watering one of the plants, but by upgrading the power, it could instead trigger a Plant Food from </w:t>
+      </w:r>
+      <w:proofErr w:type="spellStart"/>
+      <w:r>
+        <w:t>PvZ</w:t>
+      </w:r>
+      <w:proofErr w:type="spellEnd"/>
+      <w:r>
+        <w:t xml:space="preserve"> 2.</w:t>
+      </w:r>
+    </w:p>
+    <w:p>
+      <w:pPr>
+        <w:pStyle w:val="Titre3"/>
+      </w:pPr>
+      <w:r>
+        <w:t>Nate Timely</w:t>
+      </w:r>
+    </w:p>
+    <w:p>
+      <w:r>
+        <w:t>Despite presenting himself as a wannabe adventurer, Nate Timely often finds himself easily cornered by zombies, and instead relying entirely on plants, notably by cowering behind protectors. This is also seen in his future self, who develops technologies, so he doesn’t need to engage with the zombies directly.</w:t>
+      </w:r>
+    </w:p>
+    <w:p>
+      <w:r>
+        <w:t>As a reflection of this, Nate Timely will occasionally spawn support plants. At first, these are Wall-nuts that spawn randomly, taking hits from zombies which happen to walk into it.</w:t>
+      </w:r>
+      <w:r>
+        <w:t xml:space="preserve"> </w:t>
+      </w:r>
+      <w:r>
+        <w:t>The power could then be upgraded into a stronger Tall-nut or the more efficient Sweet Potato.</w:t>
+      </w:r>
+    </w:p>
+    <w:p>
+      <w:pPr>
+        <w:pStyle w:val="Titre3"/>
+      </w:pPr>
+      <w:r>
+        <w:t>Patrice Blazing</w:t>
+      </w:r>
+    </w:p>
+    <w:p>
+      <w:r>
+        <w:t>Patrice Blazing is the most adventurous of the two protagonists. Despite presenting herself as the more serious and stable-headed one, she often engages the zombies a lot more directly, becoming a martial arts expert in her adulthood.</w:t>
+      </w:r>
+    </w:p>
+    <w:p>
+      <w:r>
+        <w:t>Furthermore, despite her close relation to Sunflowers, she is notable for her direct combat, and her power reflects this, notably referencing the first issue of the comics’ cover, where she prepares to swing a Cherr</w:t>
+      </w:r>
+      <w:r>
+        <w:t>y</w:t>
+      </w:r>
+      <w:r>
+        <w:t xml:space="preserve"> Bomb at the zombies.</w:t>
+      </w:r>
+    </w:p>
+    <w:p>
+      <w:r>
+        <w:t>Patrice Blazing would occasionally throw an instant plant at the zombies, dealing heavy damage. At first, this would be a Cherr</w:t>
+      </w:r>
+      <w:r>
+        <w:t>y</w:t>
+      </w:r>
+      <w:r>
+        <w:t xml:space="preserve"> Bomb aimed randomly, but it could be upgraded into a variety of different instant plants with varied attack patterns.</w:t>
+      </w:r>
+      <w:r>
+        <w:br w:type="page"/>
+      </w:r>
+    </w:p>
+    <w:p>
+      <w:pPr>
+        <w:pStyle w:val="Titre1"/>
+      </w:pPr>
+      <w:r>
         <w:lastRenderedPageBreak/>
-        <w:t xml:space="preserve">There are currently three player characters planned for the game: Crazy Dave, as well as Nate Timely and Patrice Blazing from the </w:t>
+        <w:t>Campaign</w:t>
+      </w:r>
+      <w:r>
+        <w:t xml:space="preserve"> Mode</w:t>
+      </w:r>
+    </w:p>
+    <w:p>
+      <w:r>
+        <w:t xml:space="preserve">The Campaign Mode is a non-endless story-driven game mode with scripted waves of zombies and a final boss fight that reference the first issue of the </w:t>
       </w:r>
       <w:proofErr w:type="spellStart"/>
       <w:r>
@@ -421,128 +545,10 @@
       </w:r>
       <w:proofErr w:type="spellEnd"/>
       <w:r>
-        <w:t xml:space="preserve"> comics. The latter two are not available by default, instead unlocked by playing the campaign mode explain in the following chapter.</w:t>
-      </w:r>
-    </w:p>
-    <w:p>
-      <w:pPr>
-        <w:pStyle w:val="Titre3"/>
-      </w:pPr>
-      <w:r>
-        <w:t>Crazy Dave</w:t>
-      </w:r>
-    </w:p>
-    <w:p>
-      <w:r>
-        <w:t xml:space="preserve">Crazy Dave’s power reflects his caretaker personality, as the creator and keeper of the plants. In the comics especially, Crazy Dave shows he cares a lot for the plants. This is also seen in the </w:t>
+        <w:t xml:space="preserve"> comics, </w:t>
       </w:r>
       <w:proofErr w:type="spellStart"/>
       <w:r>
-        <w:t>PvZ</w:t>
-      </w:r>
-      <w:proofErr w:type="spellEnd"/>
-      <w:r>
-        <w:t xml:space="preserve"> games, with the various entries of the Zen Garden and plant buffs.</w:t>
-      </w:r>
-    </w:p>
-    <w:p>
-      <w:r>
-        <w:t xml:space="preserve">As such, Crazy Dave’s power will make him occasionally buff a plant. At the start, this can be a simple temporary attack speed buff by watering one of the plants, but by upgrading the power, it could instead trigger a Plant Food from </w:t>
-      </w:r>
-      <w:proofErr w:type="spellStart"/>
-      <w:r>
-        <w:t>PvZ</w:t>
-      </w:r>
-      <w:proofErr w:type="spellEnd"/>
-      <w:r>
-        <w:t xml:space="preserve"> 2.</w:t>
-      </w:r>
-    </w:p>
-    <w:p>
-      <w:pPr>
-        <w:pStyle w:val="Titre3"/>
-      </w:pPr>
-      <w:r>
-        <w:t>Nate Timely</w:t>
-      </w:r>
-    </w:p>
-    <w:p>
-      <w:r>
-        <w:t>Despite presenting himself as a wannabe adventurer, Nate Timely often finds himself easily cornered by zombies, and instead relying entirely on plants, notably by cowering behind protectors. This is also seen in his future self, who develops technologies, so he doesn’t need to engage with the zombies directly.</w:t>
-      </w:r>
-    </w:p>
-    <w:p>
-      <w:r>
-        <w:t>As a reflection of this, Nate Timely will occasionally spawn support plants. At first, these are Wall-nuts that spawn randomly, taking hits from zombies which happen to walk into it.</w:t>
-      </w:r>
-      <w:r>
-        <w:t xml:space="preserve"> </w:t>
-      </w:r>
-      <w:r>
-        <w:t>The power could then be upgraded into a stronger Tall-nut or the more efficient Sweet Potato.</w:t>
-      </w:r>
-    </w:p>
-    <w:p>
-      <w:pPr>
-        <w:pStyle w:val="Titre3"/>
-      </w:pPr>
-      <w:r>
-        <w:t>Patrice Blazing</w:t>
-      </w:r>
-    </w:p>
-    <w:p>
-      <w:r>
-        <w:t>Patrice Blazing is the most adventurous of the two protagonists. Despite presenting herself as the more serious and stable-headed one, she often engages the zombies a lot more directly, becoming a martial arts expert in her adulthood.</w:t>
-      </w:r>
-    </w:p>
-    <w:p>
-      <w:r>
-        <w:t>Furthermore, despite her close relation to Sunflowers, she is notable for her direct combat, and her power reflects this, notably referencing the first issue of the comics’ cover, where she prepares to swing a Cherr</w:t>
-      </w:r>
-      <w:r>
-        <w:t>y</w:t>
-      </w:r>
-      <w:r>
-        <w:t xml:space="preserve"> Bomb at the zombies.</w:t>
-      </w:r>
-    </w:p>
-    <w:p>
-      <w:r>
-        <w:t>Patrice Blazing would occasionally throw an instant plant at the zombies, dealing heavy damage. At first, this would be a Cherr</w:t>
-      </w:r>
-      <w:r>
-        <w:t>y</w:t>
-      </w:r>
-      <w:r>
-        <w:t xml:space="preserve"> Bomb aimed randomly, but it could be upgraded into a variety of different instant plants with varied attack patterns.</w:t>
-      </w:r>
-    </w:p>
-    <w:p>
-      <w:pPr>
-        <w:pStyle w:val="Titre1"/>
-      </w:pPr>
-      <w:r>
-        <w:t>Campaign</w:t>
-      </w:r>
-      <w:r>
-        <w:t xml:space="preserve"> Mode</w:t>
-      </w:r>
-    </w:p>
-    <w:p>
-      <w:r>
-        <w:t xml:space="preserve">The Campaign Mode is a non-endless story-driven game mode with scripted waves of zombies and a final boss fight that reference the first issue of the </w:t>
-      </w:r>
-      <w:proofErr w:type="spellStart"/>
-      <w:r>
-        <w:t>PvZ</w:t>
-      </w:r>
-      <w:proofErr w:type="spellEnd"/>
-      <w:r>
-        <w:t xml:space="preserve"> comics, </w:t>
-      </w:r>
-      <w:proofErr w:type="spellStart"/>
-      <w:r>
-        <w:lastRenderedPageBreak/>
         <w:t>Lawnmageddon</w:t>
       </w:r>
       <w:proofErr w:type="spellEnd"/>

</xml_diff>